<commit_message>
chore: freeze milestone 0 baseline
</commit_message>
<xml_diff>
--- a/reports/reports.docx
+++ b/reports/reports.docx
@@ -3802,11 +3802,11 @@
     </w:p>
     <w:p>
       <w:r>
-        <w:t xml:space="preserve">Phần còn lại của báo cáo được tổ chức như sau: Phần I tóm tắt bối cảnh thị trường, các phương pháp dự báo hiện có và giới thiệu mô hình Kronos cùng những thách thức phân phối dữ liệu. Phần II trình bày chi tiết cơ sở lý thuyết và toàn bộ quy trình triển khai, từ thu thập dữ liệu, tiền xử lý, thiết kế huấn luyện hai giai đoạn cho đến suy luận và logic nghiệp vụ. Phần III mô tả thiết lập thực nghiệm walk-forward và các kết quả đánh giá </w:t>
+        <w:t xml:space="preserve">Phần còn lại của báo cáo được tổ chức như sau: Phần I tóm tắt bối cảnh thị trường, các phương pháp dự báo hiện có và giới thiệu mô hình Kronos cùng những thách thức phân phối dữ liệu. Phần II trình bày chi tiết cơ sở lý thuyết và toàn bộ quy trình triển khai, từ thu thập dữ liệu, tiền xử lý, thiết kế huấn luyện hai giai đoạn cho đến suy luận và logic nghiệp vụ. Phần III mô tả thiết lập thực nghiệm và các kết quả đánh giá trên nhiều chiều </w:t>
       </w:r>
       <w:r>
         <w:lastRenderedPageBreak/>
-        <w:t>trên nhiều chiều cạnh. Cuối cùng, Phần IV tổng kết đóng góp, nhìn nhận thẳng thắn các hạn chế, và đề xuất hướng phát triển trong tương lai.</w:t>
+        <w:t>cạnh. Cuối cùng, Phần IV tổng kết đóng góp, nhìn nhận thẳng thắn các hạn chế, và đề xuất hướng phát triển trong tương lai.</w:t>
       </w:r>
     </w:p>
     <w:p>
@@ -7758,7 +7758,7 @@
       </w:pPr>
       <w:r>
         <w:drawing>
-          <wp:inline distT="0" distB="0" distL="0" distR="0" wp14:anchorId="624EAD24" wp14:editId="1F5DD547">
+          <wp:inline distT="0" distB="0" distL="0" distR="0" wp14:anchorId="624EAD24" wp14:editId="4512D49B">
             <wp:extent cx="4861560" cy="2567966"/>
             <wp:effectExtent l="0" t="0" r="0" b="3810"/>
             <wp:docPr id="1541549844" name="Hình ảnh 1"/>
@@ -22410,9 +22410,11 @@
     <w:rsid w:val="009E41DA"/>
     <w:rsid w:val="00AF3BB8"/>
     <w:rsid w:val="00B22FA4"/>
+    <w:rsid w:val="00B7008D"/>
     <w:rsid w:val="00D36E6B"/>
     <w:rsid w:val="00D97BDC"/>
     <w:rsid w:val="00DC1835"/>
+    <w:rsid w:val="00ED7912"/>
   </w:rsids>
   <m:mathPr>
     <m:mathFont m:val="Cambria Math"/>

</xml_diff>